<commit_message>
Hợp đồng Word: fix dòng trắng dư trong header đẩy nội dung xuống
Đoạn cuối header2.xml là 1 paragraph trống chứa watermark logo (neo
tuyệt đối theo margin), nhưng paragraph đó vẫn áp style "Header" nên
chiếm 1 dòng cao mặc định dù không có chữ — tạo khoảng trắng dư giữa
đường line và "HỢP ĐỒNG DỊCH VỤ". Thu nhỏ line-height paragraph này về
mức tối thiểu (line=20 exact, sz=2) — watermark không bị ảnh hưởng vì
được neo theo margin, không theo dòng chữ.

Co-Authored-By: Claude Sonnet 4.6 <noreply@anthropic.com>
</commit_message>
<xml_diff>
--- a/templates/hop-dong-dich-vu.docx
+++ b/templates/hop-dong-dich-vu.docx
@@ -6245,6 +6245,10 @@
       <w:p>
         <w:pPr>
           <w:pStyle w:val="Header"/>
+          <w:spacing w:before="0" w:after="0" w:line="20" w:lineRule="exact"/>
+          <w:rPr>
+            <w:sz w:val="2"/>
+          </w:rPr>
         </w:pPr>
         <w:r>
           <w:rPr>

</xml_diff>

<commit_message>
Hợp đồng Word: thu nhỏ logo + hàng bảng header để hết khoảng trắng dư
Nguyên nhân thật: hàng bảng chứa logo trong header bị ép cao ~1.96cm
(bằng đúng chiều cao logo gốc), trong khi khối tên/địa chỉ công ty căn
giữa theo chiều dọc (vAlign:center) chỉ cao ~0.8cm — phần dư ra (~0.6cm
mỗi bên) hiện thành khoảng trắng quanh đường line, không phải do
paragraph watermark (đã sửa ở commit trước, không đủ vì sai nguyên nhân).

Thu nhỏ logo (~62%) và hàng bảng tương ứng (1131 → 700 twips) để khối
header gọn sát nội dung, giữ đúng tỉ lệ logo, không ảnh hưởng watermark.

Co-Authored-By: Claude Sonnet 4.6 <noreply@anthropic.com>
</commit_message>
<xml_diff>
--- a/templates/hop-dong-dich-vu.docx
+++ b/templates/hop-dong-dich-vu.docx
@@ -6109,7 +6109,7 @@
     </w:tblGrid>
     <w:tr>
       <w:trPr>
-        <w:trHeight w:val="1131"/>
+        <w:trHeight w:val="700"/>
       </w:trPr>
       <w:tc>
         <w:tcPr>
@@ -6132,7 +6132,7 @@
                 <wp:positionV relativeFrom="paragraph">
                   <wp:posOffset>-3810</wp:posOffset>
                 </wp:positionV>
-                <wp:extent cx="978596" cy="685800"/>
+                <wp:extent cx="605800" cy="424600"/>
                 <wp:effectExtent l="0" t="0" r="0" b="0"/>
                 <wp:wrapNone/>
                 <wp:docPr id="2" name="Picture 2"/>
@@ -6164,7 +6164,7 @@
                       <pic:spPr bwMode="auto">
                         <a:xfrm>
                           <a:off x="0" y="0"/>
-                          <a:ext cx="978596" cy="685800"/>
+                          <a:ext cx="605800" cy="424600"/>
                         </a:xfrm>
                         <a:prstGeom prst="rect">
                           <a:avLst/>

</xml_diff>

<commit_message>
Hợp đồng Word: thu hẹp khoảng trắng giữa đường line header và ranh giới header
Đường line vàng là viền DƯỚI của bảng (tblBorders), vị trí cố định ở đáy
hàng — không di chuyển theo vAlign nội dung chữ. Khoảng trắng dư nằm
giữa đáy bảng và mép lề trên trang (nơi Word vẽ ranh giới kết thúc
header), do lề trên + khoảng cách header vẫn còn dư so với chiều cao
bảng đã thu nhỏ ở commit trước.

- Lề trên: 1058 → 950 twips; khoảng cách header: 284 → 200 twips —
  thu hẹp phần dư sau bảng.
- Đổi vAlign cột tên/địa chỉ từ "center" → "bottom": chữ + sát đáy hàng
  (gần đường line) thay vì lơ lửng giữa hàng, gọn hơn.

Co-Authored-By: Claude Sonnet 4.6 <noreply@anthropic.com>
</commit_message>
<xml_diff>
--- a/templates/hop-dong-dich-vu.docx
+++ b/templates/hop-dong-dich-vu.docx
@@ -5911,7 +5911,7 @@
       <w:footerReference w:type="default" r:id="rId9"/>
       <w:headerReference w:type="first" r:id="rId10"/>
       <w:pgSz w:w="12240" w:h="15840"/>
-      <w:pgMar w:top="1058" w:right="1440" w:bottom="1440" w:left="1440" w:header="284" w:footer="720" w:gutter="0"/>
+      <w:pgMar w:top="950" w:right="1440" w:bottom="1440" w:left="1440" w:header="200" w:footer="720" w:gutter="0"/>
       <w:cols w:space="720"/>
       <w:docGrid w:linePitch="360"/>
     </w:sectPr>
@@ -6185,7 +6185,7 @@
       <w:tc>
         <w:tcPr>
           <w:tcW w:w="7654" w:type="dxa"/>
-          <w:vAlign w:val="center"/>
+          <w:vAlign w:val="bottom"/>
         </w:tcPr>
         <w:p>
           <w:pPr>

</xml_diff>

<commit_message>
Hợp đồng Word: di chuyển watermark khỏi paragraph riêng sau bảng header
Đã xác nhận chính xác nguyên nhân: dòng trắng dư nằm NGAY DƯỚI đường line
(không phải do logo/watermark hiển thị) — vì watermark được đặt trong 1
paragraph RIÊNG, độc lập, nằm SAU bảng (sau đường line), bản thân
paragraph đó dù đã ép line-height tối thiểu vẫn tạo ra 1 dòng trong luồng
văn bản của header.

Fix triệt để: chuyển nguyên cụm watermark (run chứa <w:pict>) vào CUỐI
paragraph địa chỉ — đã có trong bảng, KHÔNG tạo dòng mới. Paragraph rỗng
còn lại (buộc phải giữ vì là nội dung bắt buộc của content-control sdt)
giờ thực sự trống — không ảnh/pict — nên không còn nội dung nào tạo dòng
dư sau đường line.

Co-Authored-By: Claude Sonnet 4.6 <noreply@anthropic.com>
</commit_message>
<xml_diff>
--- a/templates/hop-dong-dich-vu.docx
+++ b/templates/hop-dong-dich-vu.docx
@@ -6228,6 +6228,36 @@
             </w:rPr>
             <w:t>16 Bình Lợi, Phường Bình Lợi Trung, Thành phố Hồ Chí Minh</w:t>
           </w:r>
+          <w:r>
+            <w:rPr>
+              <w:noProof/>
+            </w:rPr>
+            <w:pict w14:anchorId="08C2E3B7">
+              <v:shapetype id="_x0000_t75" coordsize="21600,21600" o:spt="75" o:preferrelative="t" path="m@4@5l@4@11@9@11@9@5xe" filled="f" stroked="f">
+                <v:stroke joinstyle="miter"/>
+                <v:formulas>
+                  <v:f eqn="if lineDrawn pixelLineWidth 0"/>
+                  <v:f eqn="sum @0 1 0"/>
+                  <v:f eqn="sum 0 0 @1"/>
+                  <v:f eqn="prod @2 1 2"/>
+                  <v:f eqn="prod @3 21600 pixelWidth"/>
+                  <v:f eqn="prod @3 21600 pixelHeight"/>
+                  <v:f eqn="sum @0 0 1"/>
+                  <v:f eqn="prod @6 1 2"/>
+                  <v:f eqn="prod @7 21600 pixelWidth"/>
+                  <v:f eqn="sum @8 21600 0"/>
+                  <v:f eqn="prod @7 21600 pixelHeight"/>
+                  <v:f eqn="sum @10 21600 0"/>
+                </v:formulas>
+                <v:path o:extrusionok="f" gradientshapeok="t" o:connecttype="rect"/>
+                <o:lock v:ext="edit" aspectratio="t"/>
+              </v:shapetype>
+              <v:shape id="WordPictureWatermark292160955" o:spid="_x0000_s2053" type="#_x0000_t75" style="position:absolute;margin-left:68.4pt;margin-top:143.25pt;width:330.5pt;height:330.5pt;z-index:-251653120;mso-position-horizontal-relative:margin;mso-position-vertical-relative:margin" o:allowincell="f">
+                <v:imagedata r:id="rId2" o:title="logo-savitax" gain="19661f" blacklevel="22938f"/>
+                <w10:wrap anchorx="margin" anchory="margin"/>
+              </v:shape>
+            </w:pict>
+          </w:r>
         </w:p>
       </w:tc>
     </w:tr>
@@ -6250,36 +6280,6 @@
             <w:sz w:val="2"/>
           </w:rPr>
         </w:pPr>
-        <w:r>
-          <w:rPr>
-            <w:noProof/>
-          </w:rPr>
-          <w:pict w14:anchorId="08C2E3B7">
-            <v:shapetype id="_x0000_t75" coordsize="21600,21600" o:spt="75" o:preferrelative="t" path="m@4@5l@4@11@9@11@9@5xe" filled="f" stroked="f">
-              <v:stroke joinstyle="miter"/>
-              <v:formulas>
-                <v:f eqn="if lineDrawn pixelLineWidth 0"/>
-                <v:f eqn="sum @0 1 0"/>
-                <v:f eqn="sum 0 0 @1"/>
-                <v:f eqn="prod @2 1 2"/>
-                <v:f eqn="prod @3 21600 pixelWidth"/>
-                <v:f eqn="prod @3 21600 pixelHeight"/>
-                <v:f eqn="sum @0 0 1"/>
-                <v:f eqn="prod @6 1 2"/>
-                <v:f eqn="prod @7 21600 pixelWidth"/>
-                <v:f eqn="sum @8 21600 0"/>
-                <v:f eqn="prod @7 21600 pixelHeight"/>
-                <v:f eqn="sum @10 21600 0"/>
-              </v:formulas>
-              <v:path o:extrusionok="f" gradientshapeok="t" o:connecttype="rect"/>
-              <o:lock v:ext="edit" aspectratio="t"/>
-            </v:shapetype>
-            <v:shape id="WordPictureWatermark292160955" o:spid="_x0000_s2053" type="#_x0000_t75" style="position:absolute;margin-left:68.4pt;margin-top:143.25pt;width:330.5pt;height:330.5pt;z-index:-251653120;mso-position-horizontal-relative:margin;mso-position-vertical-relative:margin" o:allowincell="f">
-              <v:imagedata r:id="rId2" o:title="logo-savitax" gain="19661f" blacklevel="22938f"/>
-              <w10:wrap anchorx="margin" anchory="margin"/>
-            </v:shape>
-          </w:pict>
-        </w:r>
       </w:p>
     </w:sdtContent>
   </w:sdt>

</xml_diff>

<commit_message>
Hợp đồng Word: build lại template hoàn toàn từ file chuẩn mới do người dùng cung cấp
Thay vì tiếp tục vá template cũ (đã bị sửa chồng chéo qua nhiều lần đoán
sai nguyên nhân dòng trắng dư trong header), build lại templates/hop-dong-dich-vu.docx
từ đầu dựa trên file HopDong_HOANGTIENSG (2).docx — bản người dùng đã tự
chỉnh chuẩn định dạng trong Word. Áp lại đúng 10 placeholder như cũ
({so_hd} {ngay_lap} {ten_cong_ty} {dia_chi} {mst} {nguoi_dai_dien}
{tu_ngay} {den_ngay} {phi_dich_vu} {phi_bang_chu}), đã verify số lần
khớp đúng dự kiến, không sót giá trị cũ, render thử thành công.

Co-Authored-By: Claude Sonnet 4.6 <noreply@anthropic.com>
</commit_message>
<xml_diff>
--- a/templates/hop-dong-dich-vu.docx
+++ b/templates/hop-dong-dich-vu.docx
@@ -116,6 +116,8 @@
         </w:rPr>
         <w:t>Căn cứ Luật Quản lý thuế số 106/2016/QH13 có hiệu lực thi hành từ ngày 01/07/2016.</w:t>
       </w:r>
+      <w:bookmarkStart w:id="0" w:name="_GoBack"/>
+      <w:bookmarkEnd w:id="0"/>
     </w:p>
     <w:p>
       <w:pPr>
@@ -5489,18 +5491,7 @@
           <w:sz w:val="26"/>
           <w:szCs w:val="26"/>
         </w:rPr>
-        <w:t>Các quận Thủ Đức, quận 2, quận 7, quận 9 phụ thu tiền xăng 200.000đ/tháng. Các Huyện Nhà Bè, Bình Chán</w:t>
-      </w:r>
-      <w:bookmarkStart w:id="0" w:name="_GoBack"/>
-      <w:bookmarkEnd w:id="0"/>
-      <w:r>
-        <w:rPr>
-          <w:rFonts w:ascii="Times New Roman" w:eastAsia="Times New Roman" w:hAnsi="Times New Roman" w:cs="Times New Roman"/>
-          <w:color w:val="1A1A1A"/>
-          <w:sz w:val="26"/>
-          <w:szCs w:val="26"/>
-        </w:rPr>
-        <w:t>h, Hóc Môn, Củ Chi phụ thu tiền xăng 500.000đ/tháng.</w:t>
+        <w:t>Các quận Thủ Đức, quận 2, quận 7, quận 9 phụ thu tiền xăng 200.000đ/tháng. Các Huyện Nhà Bè, Bình Chánh, Hóc Môn, Củ Chi phụ thu tiền xăng 500.000đ/tháng.</w:t>
       </w:r>
     </w:p>
     <w:p>
@@ -5552,7 +5543,6 @@
           <w:sz w:val="26"/>
           <w:szCs w:val="26"/>
         </w:rPr>
-        <w:lastRenderedPageBreak/>
         <w:t>Giá trên chưa bao gồm thuế giá trị gia tăng và các loại thuế DN phải nộp cho cơ quan thuế.</w:t>
       </w:r>
     </w:p>
@@ -5609,6 +5599,7 @@
                 <w:sz w:val="24"/>
                 <w:szCs w:val="24"/>
               </w:rPr>
+              <w:lastRenderedPageBreak/>
               <w:t>ĐẠI DIỆN BÊN A</w:t>
             </w:r>
           </w:p>
@@ -5911,7 +5902,7 @@
       <w:footerReference w:type="default" r:id="rId9"/>
       <w:headerReference w:type="first" r:id="rId10"/>
       <w:pgSz w:w="12240" w:h="15840"/>
-      <w:pgMar w:top="950" w:right="1440" w:bottom="1440" w:left="1440" w:header="200" w:footer="720" w:gutter="0"/>
+      <w:pgMar w:top="1058" w:right="1440" w:bottom="1440" w:left="1440" w:header="284" w:footer="720" w:gutter="0"/>
       <w:cols w:space="720"/>
       <w:docGrid w:linePitch="360"/>
     </w:sectPr>
@@ -6109,7 +6100,7 @@
     </w:tblGrid>
     <w:tr>
       <w:trPr>
-        <w:trHeight w:val="700"/>
+        <w:trHeight w:val="1131"/>
       </w:trPr>
       <w:tc>
         <w:tcPr>
@@ -6132,7 +6123,7 @@
                 <wp:positionV relativeFrom="paragraph">
                   <wp:posOffset>-3810</wp:posOffset>
                 </wp:positionV>
-                <wp:extent cx="605800" cy="424600"/>
+                <wp:extent cx="978596" cy="685800"/>
                 <wp:effectExtent l="0" t="0" r="0" b="0"/>
                 <wp:wrapNone/>
                 <wp:docPr id="2" name="Picture 2"/>
@@ -6164,7 +6155,7 @@
                       <pic:spPr bwMode="auto">
                         <a:xfrm>
                           <a:off x="0" y="0"/>
-                          <a:ext cx="605800" cy="424600"/>
+                          <a:ext cx="978596" cy="685800"/>
                         </a:xfrm>
                         <a:prstGeom prst="rect">
                           <a:avLst/>
@@ -6185,7 +6176,7 @@
       <w:tc>
         <w:tcPr>
           <w:tcW w:w="7654" w:type="dxa"/>
-          <w:vAlign w:val="bottom"/>
+          <w:vAlign w:val="center"/>
         </w:tcPr>
         <w:p>
           <w:pPr>
@@ -6228,36 +6219,6 @@
             </w:rPr>
             <w:t>16 Bình Lợi, Phường Bình Lợi Trung, Thành phố Hồ Chí Minh</w:t>
           </w:r>
-          <w:r>
-            <w:rPr>
-              <w:noProof/>
-            </w:rPr>
-            <w:pict w14:anchorId="08C2E3B7">
-              <v:shapetype id="_x0000_t75" coordsize="21600,21600" o:spt="75" o:preferrelative="t" path="m@4@5l@4@11@9@11@9@5xe" filled="f" stroked="f">
-                <v:stroke joinstyle="miter"/>
-                <v:formulas>
-                  <v:f eqn="if lineDrawn pixelLineWidth 0"/>
-                  <v:f eqn="sum @0 1 0"/>
-                  <v:f eqn="sum 0 0 @1"/>
-                  <v:f eqn="prod @2 1 2"/>
-                  <v:f eqn="prod @3 21600 pixelWidth"/>
-                  <v:f eqn="prod @3 21600 pixelHeight"/>
-                  <v:f eqn="sum @0 0 1"/>
-                  <v:f eqn="prod @6 1 2"/>
-                  <v:f eqn="prod @7 21600 pixelWidth"/>
-                  <v:f eqn="sum @8 21600 0"/>
-                  <v:f eqn="prod @7 21600 pixelHeight"/>
-                  <v:f eqn="sum @10 21600 0"/>
-                </v:formulas>
-                <v:path o:extrusionok="f" gradientshapeok="t" o:connecttype="rect"/>
-                <o:lock v:ext="edit" aspectratio="t"/>
-              </v:shapetype>
-              <v:shape id="WordPictureWatermark292160955" o:spid="_x0000_s2053" type="#_x0000_t75" style="position:absolute;margin-left:68.4pt;margin-top:143.25pt;width:330.5pt;height:330.5pt;z-index:-251653120;mso-position-horizontal-relative:margin;mso-position-vertical-relative:margin" o:allowincell="f">
-                <v:imagedata r:id="rId2" o:title="logo-savitax" gain="19661f" blacklevel="22938f"/>
-                <w10:wrap anchorx="margin" anchory="margin"/>
-              </v:shape>
-            </w:pict>
-          </w:r>
         </w:p>
       </w:tc>
     </w:tr>
@@ -6275,11 +6236,41 @@
       <w:p>
         <w:pPr>
           <w:pStyle w:val="Header"/>
-          <w:spacing w:before="0" w:after="0" w:line="20" w:lineRule="exact"/>
+          <w:spacing w:line="20" w:lineRule="exact"/>
           <w:rPr>
             <w:sz w:val="2"/>
           </w:rPr>
         </w:pPr>
+        <w:r>
+          <w:rPr>
+            <w:noProof/>
+          </w:rPr>
+          <w:pict w14:anchorId="08C2E3B7">
+            <v:shapetype id="_x0000_t75" coordsize="21600,21600" o:spt="75" o:preferrelative="t" path="m@4@5l@4@11@9@11@9@5xe" filled="f" stroked="f">
+              <v:stroke joinstyle="miter"/>
+              <v:formulas>
+                <v:f eqn="if lineDrawn pixelLineWidth 0"/>
+                <v:f eqn="sum @0 1 0"/>
+                <v:f eqn="sum 0 0 @1"/>
+                <v:f eqn="prod @2 1 2"/>
+                <v:f eqn="prod @3 21600 pixelWidth"/>
+                <v:f eqn="prod @3 21600 pixelHeight"/>
+                <v:f eqn="sum @0 0 1"/>
+                <v:f eqn="prod @6 1 2"/>
+                <v:f eqn="prod @7 21600 pixelWidth"/>
+                <v:f eqn="sum @8 21600 0"/>
+                <v:f eqn="prod @7 21600 pixelHeight"/>
+                <v:f eqn="sum @10 21600 0"/>
+              </v:formulas>
+              <v:path o:extrusionok="f" gradientshapeok="t" o:connecttype="rect"/>
+              <o:lock v:ext="edit" aspectratio="t"/>
+            </v:shapetype>
+            <v:shape id="WordPictureWatermark292160955" o:spid="_x0000_s2053" type="#_x0000_t75" style="position:absolute;margin-left:68.4pt;margin-top:143.25pt;width:330.5pt;height:330.5pt;z-index:-251653120;mso-position-horizontal-relative:margin;mso-position-vertical-relative:margin" o:allowincell="f">
+              <v:imagedata r:id="rId2" o:title="logo-savitax" gain="19661f" blacklevel="22938f"/>
+              <w10:wrap anchorx="margin" anchory="margin"/>
+            </v:shape>
+          </w:pict>
+        </w:r>
       </w:p>
     </w:sdtContent>
   </w:sdt>

</xml_diff>